<commit_message>
1. Cleaned up the upgrade to pro pop-up when you run out of free uses. 2. Changed Templates screen: Added a guide button, modified the look of the page, added preview when uploading templates as well as preview button for already made templates. 3. Modified backend to preview templates and fill placeholders in the previews. 4. downloaded https and mammoth libraries in backend.
</commit_message>
<xml_diff>
--- a/Mahdar Templates/En_Mahdar_Template_1.docx
+++ b/Mahdar Templates/En_Mahdar_Template_1.docx
@@ -23,12 +23,6 @@
         <w:gridCol w:w="10080"/>
       </w:tblGrid>
       <w:tr>
-        <w:tblPrEx>
-          <w:tblCellMar>
-            <w:top w:w="0" w:type="dxa"/>
-            <w:bottom w:w="0" w:type="dxa"/>
-          </w:tblCellMar>
-        </w:tblPrEx>
         <w:tc>
           <w:tcPr>
             <w:tcW w:w="0" w:type="auto"/>
@@ -107,12 +101,6 @@
         <w:gridCol w:w="2640"/>
       </w:tblGrid>
       <w:tr>
-        <w:tblPrEx>
-          <w:tblCellMar>
-            <w:top w:w="0" w:type="dxa"/>
-            <w:bottom w:w="0" w:type="dxa"/>
-          </w:tblCellMar>
-        </w:tblPrEx>
         <w:tc>
           <w:tcPr>
             <w:tcW w:w="2400" w:type="dxa"/>
@@ -217,12 +205,6 @@
         </w:tc>
       </w:tr>
       <w:tr>
-        <w:tblPrEx>
-          <w:tblCellMar>
-            <w:top w:w="0" w:type="dxa"/>
-            <w:bottom w:w="0" w:type="dxa"/>
-          </w:tblCellMar>
-        </w:tblPrEx>
         <w:tc>
           <w:tcPr>
             <w:tcW w:w="2400" w:type="dxa"/>
@@ -277,12 +259,6 @@
         </w:tc>
       </w:tr>
       <w:tr>
-        <w:tblPrEx>
-          <w:tblCellMar>
-            <w:top w:w="0" w:type="dxa"/>
-            <w:bottom w:w="0" w:type="dxa"/>
-          </w:tblCellMar>
-        </w:tblPrEx>
         <w:trPr>
           <w:trHeight w:val="346"/>
         </w:trPr>
@@ -334,7 +310,15 @@
           </w:tcPr>
           <w:p>
             <w:r>
-              <w:t>{{next_meeting}}</w:t>
+              <w:t>{{</w:t>
+            </w:r>
+            <w:proofErr w:type="spellStart"/>
+            <w:r>
+              <w:t>next_meeting</w:t>
+            </w:r>
+            <w:proofErr w:type="spellEnd"/>
+            <w:r>
+              <w:t>}}</w:t>
             </w:r>
           </w:p>
         </w:tc>
@@ -386,12 +370,6 @@
         <w:gridCol w:w="3360"/>
       </w:tblGrid>
       <w:tr>
-        <w:tblPrEx>
-          <w:tblCellMar>
-            <w:top w:w="0" w:type="dxa"/>
-            <w:bottom w:w="0" w:type="dxa"/>
-          </w:tblCellMar>
-        </w:tblPrEx>
         <w:tc>
           <w:tcPr>
             <w:tcW w:w="3360" w:type="dxa"/>
@@ -496,12 +474,6 @@
         </w:tc>
       </w:tr>
       <w:tr>
-        <w:tblPrEx>
-          <w:tblCellMar>
-            <w:top w:w="0" w:type="dxa"/>
-            <w:bottom w:w="0" w:type="dxa"/>
-          </w:tblCellMar>
-        </w:tblPrEx>
         <w:tc>
           <w:tcPr>
             <w:tcW w:w="3360" w:type="dxa"/>
@@ -525,19 +497,19 @@
               <w:rPr>
                 <w:rFonts w:asciiTheme="majorBidi" w:hAnsiTheme="majorBidi" w:cstheme="majorBidi"/>
               </w:rPr>
-              <w:t>{%tr for item in at</w:t>
+              <w:t xml:space="preserve">{%tr for </w:t>
             </w:r>
             <w:r>
               <w:rPr>
                 <w:rFonts w:asciiTheme="majorBidi" w:hAnsiTheme="majorBidi" w:cstheme="majorBidi"/>
               </w:rPr>
-              <w:t>tendees</w:t>
+              <w:t>attendee</w:t>
             </w:r>
             <w:r>
               <w:rPr>
                 <w:rFonts w:asciiTheme="majorBidi" w:hAnsiTheme="majorBidi" w:cstheme="majorBidi"/>
               </w:rPr>
-              <w:t xml:space="preserve"> %}</w:t>
+              <w:t xml:space="preserve"> in attendees %}</w:t>
             </w:r>
           </w:p>
         </w:tc>
@@ -581,12 +553,6 @@
         </w:tc>
       </w:tr>
       <w:tr>
-        <w:tblPrEx>
-          <w:tblCellMar>
-            <w:top w:w="0" w:type="dxa"/>
-            <w:bottom w:w="0" w:type="dxa"/>
-          </w:tblCellMar>
-        </w:tblPrEx>
         <w:tc>
           <w:tcPr>
             <w:tcW w:w="3360" w:type="dxa"/>
@@ -610,12 +576,24 @@
               <w:rPr>
                 <w:rFonts w:asciiTheme="majorHAnsi" w:hAnsiTheme="majorHAnsi" w:cstheme="majorHAnsi"/>
               </w:rPr>
-              <w:t>{{ item.</w:t>
+              <w:t xml:space="preserve">{{ </w:t>
             </w:r>
             <w:r>
               <w:rPr>
                 <w:rFonts w:asciiTheme="majorHAnsi" w:hAnsiTheme="majorHAnsi" w:cstheme="majorHAnsi"/>
               </w:rPr>
+              <w:t>attendee</w:t>
+            </w:r>
+            <w:r>
+              <w:rPr>
+                <w:rFonts w:asciiTheme="majorHAnsi" w:hAnsiTheme="majorHAnsi" w:cstheme="majorHAnsi"/>
+              </w:rPr>
+              <w:t>.</w:t>
+            </w:r>
+            <w:r>
+              <w:rPr>
+                <w:rFonts w:asciiTheme="majorHAnsi" w:hAnsiTheme="majorHAnsi" w:cstheme="majorHAnsi"/>
+              </w:rPr>
               <w:t>name</w:t>
             </w:r>
             <w:r>
@@ -649,14 +627,28 @@
               <w:rPr>
                 <w:rFonts w:asciiTheme="majorHAnsi" w:hAnsiTheme="majorHAnsi" w:cstheme="majorHAnsi"/>
               </w:rPr>
-              <w:t>{{ item.</w:t>
-            </w:r>
+              <w:t xml:space="preserve">{{ </w:t>
+            </w:r>
+            <w:proofErr w:type="spellStart"/>
             <w:r>
               <w:rPr>
                 <w:rFonts w:asciiTheme="majorHAnsi" w:hAnsiTheme="majorHAnsi" w:cstheme="majorHAnsi"/>
               </w:rPr>
+              <w:t>attendee</w:t>
+            </w:r>
+            <w:r>
+              <w:rPr>
+                <w:rFonts w:asciiTheme="majorHAnsi" w:hAnsiTheme="majorHAnsi" w:cstheme="majorHAnsi"/>
+              </w:rPr>
+              <w:t>.</w:t>
+            </w:r>
+            <w:r>
+              <w:rPr>
+                <w:rFonts w:asciiTheme="majorHAnsi" w:hAnsiTheme="majorHAnsi" w:cstheme="majorHAnsi"/>
+              </w:rPr>
               <w:t>email</w:t>
             </w:r>
+            <w:proofErr w:type="spellEnd"/>
             <w:r>
               <w:rPr>
                 <w:rFonts w:asciiTheme="majorHAnsi" w:hAnsiTheme="majorHAnsi" w:cstheme="majorHAnsi"/>
@@ -688,14 +680,28 @@
               <w:rPr>
                 <w:rFonts w:asciiTheme="majorBidi" w:hAnsiTheme="majorBidi" w:cstheme="majorBidi"/>
               </w:rPr>
-              <w:t>{{ item.</w:t>
+              <w:t xml:space="preserve">{{ </w:t>
+            </w:r>
+            <w:proofErr w:type="spellStart"/>
+            <w:r>
+              <w:rPr>
+                <w:rFonts w:asciiTheme="majorHAnsi" w:hAnsiTheme="majorHAnsi" w:cstheme="majorHAnsi"/>
+              </w:rPr>
+              <w:t>attendee</w:t>
             </w:r>
             <w:r>
               <w:rPr>
                 <w:rFonts w:asciiTheme="majorBidi" w:hAnsiTheme="majorBidi" w:cstheme="majorBidi"/>
               </w:rPr>
+              <w:t>.</w:t>
+            </w:r>
+            <w:r>
+              <w:rPr>
+                <w:rFonts w:asciiTheme="majorBidi" w:hAnsiTheme="majorBidi" w:cstheme="majorBidi"/>
+              </w:rPr>
               <w:t>role</w:t>
             </w:r>
+            <w:proofErr w:type="spellEnd"/>
             <w:r>
               <w:rPr>
                 <w:rFonts w:asciiTheme="majorBidi" w:hAnsiTheme="majorBidi" w:cstheme="majorBidi"/>
@@ -706,12 +712,6 @@
         </w:tc>
       </w:tr>
       <w:tr>
-        <w:tblPrEx>
-          <w:tblCellMar>
-            <w:top w:w="0" w:type="dxa"/>
-            <w:bottom w:w="0" w:type="dxa"/>
-          </w:tblCellMar>
-        </w:tblPrEx>
         <w:tc>
           <w:tcPr>
             <w:tcW w:w="3360" w:type="dxa"/>
@@ -735,7 +735,21 @@
               <w:rPr>
                 <w:rFonts w:asciiTheme="majorBidi" w:hAnsiTheme="majorBidi" w:cstheme="majorBidi"/>
               </w:rPr>
-              <w:t>{%tr endfor %}</w:t>
+              <w:t xml:space="preserve">{%tr </w:t>
+            </w:r>
+            <w:proofErr w:type="spellStart"/>
+            <w:r>
+              <w:rPr>
+                <w:rFonts w:asciiTheme="majorBidi" w:hAnsiTheme="majorBidi" w:cstheme="majorBidi"/>
+              </w:rPr>
+              <w:t>endfor</w:t>
+            </w:r>
+            <w:proofErr w:type="spellEnd"/>
+            <w:r>
+              <w:rPr>
+                <w:rFonts w:asciiTheme="majorBidi" w:hAnsiTheme="majorBidi" w:cstheme="majorBidi"/>
+              </w:rPr>
+              <w:t xml:space="preserve"> %}</w:t>
             </w:r>
           </w:p>
         </w:tc>
@@ -877,12 +891,6 @@
         <w:gridCol w:w="2700"/>
       </w:tblGrid>
       <w:tr>
-        <w:tblPrEx>
-          <w:tblCellMar>
-            <w:top w:w="0" w:type="dxa"/>
-            <w:bottom w:w="0" w:type="dxa"/>
-          </w:tblCellMar>
-        </w:tblPrEx>
         <w:tc>
           <w:tcPr>
             <w:tcW w:w="4680" w:type="dxa"/>
@@ -987,12 +995,6 @@
         </w:tc>
       </w:tr>
       <w:tr>
-        <w:tblPrEx>
-          <w:tblCellMar>
-            <w:top w:w="0" w:type="dxa"/>
-            <w:bottom w:w="0" w:type="dxa"/>
-          </w:tblCellMar>
-        </w:tblPrEx>
         <w:tc>
           <w:tcPr>
             <w:tcW w:w="4680" w:type="dxa"/>
@@ -1018,12 +1020,14 @@
               </w:rPr>
               <w:t xml:space="preserve">{%tr for item in </w:t>
             </w:r>
+            <w:proofErr w:type="spellStart"/>
             <w:r>
               <w:rPr>
                 <w:rFonts w:asciiTheme="majorBidi" w:hAnsiTheme="majorBidi" w:cstheme="majorBidi"/>
               </w:rPr>
               <w:t>action_items</w:t>
             </w:r>
+            <w:proofErr w:type="spellEnd"/>
             <w:r>
               <w:rPr>
                 <w:rFonts w:asciiTheme="majorBidi" w:hAnsiTheme="majorBidi" w:cstheme="majorBidi"/>
@@ -1072,12 +1076,6 @@
         </w:tc>
       </w:tr>
       <w:tr>
-        <w:tblPrEx>
-          <w:tblCellMar>
-            <w:top w:w="0" w:type="dxa"/>
-            <w:bottom w:w="0" w:type="dxa"/>
-          </w:tblCellMar>
-        </w:tblPrEx>
         <w:tc>
           <w:tcPr>
             <w:tcW w:w="4680" w:type="dxa"/>
@@ -1101,14 +1099,22 @@
               <w:rPr>
                 <w:rFonts w:asciiTheme="majorHAnsi" w:hAnsiTheme="majorHAnsi" w:cstheme="majorHAnsi"/>
               </w:rPr>
-              <w:t>{{ item.</w:t>
-            </w:r>
+              <w:t xml:space="preserve">{{ </w:t>
+            </w:r>
+            <w:proofErr w:type="spellStart"/>
             <w:r>
               <w:rPr>
                 <w:rFonts w:asciiTheme="majorHAnsi" w:hAnsiTheme="majorHAnsi" w:cstheme="majorHAnsi"/>
               </w:rPr>
+              <w:t>item.</w:t>
+            </w:r>
+            <w:r>
+              <w:rPr>
+                <w:rFonts w:asciiTheme="majorHAnsi" w:hAnsiTheme="majorHAnsi" w:cstheme="majorHAnsi"/>
+              </w:rPr>
               <w:t>task</w:t>
             </w:r>
+            <w:proofErr w:type="spellEnd"/>
             <w:r>
               <w:rPr>
                 <w:rFonts w:asciiTheme="majorHAnsi" w:hAnsiTheme="majorHAnsi" w:cstheme="majorHAnsi"/>
@@ -1140,14 +1146,22 @@
               <w:rPr>
                 <w:rFonts w:asciiTheme="majorHAnsi" w:hAnsiTheme="majorHAnsi" w:cstheme="majorHAnsi"/>
               </w:rPr>
-              <w:t>{{ item.</w:t>
-            </w:r>
+              <w:t xml:space="preserve">{{ </w:t>
+            </w:r>
+            <w:proofErr w:type="spellStart"/>
             <w:r>
               <w:rPr>
                 <w:rFonts w:asciiTheme="majorHAnsi" w:hAnsiTheme="majorHAnsi" w:cstheme="majorHAnsi"/>
               </w:rPr>
+              <w:t>item.</w:t>
+            </w:r>
+            <w:r>
+              <w:rPr>
+                <w:rFonts w:asciiTheme="majorHAnsi" w:hAnsiTheme="majorHAnsi" w:cstheme="majorHAnsi"/>
+              </w:rPr>
               <w:t>owner</w:t>
             </w:r>
+            <w:proofErr w:type="spellEnd"/>
             <w:r>
               <w:rPr>
                 <w:rFonts w:asciiTheme="majorHAnsi" w:hAnsiTheme="majorHAnsi" w:cstheme="majorHAnsi"/>
@@ -1179,14 +1193,22 @@
               <w:rPr>
                 <w:rFonts w:asciiTheme="majorBidi" w:hAnsiTheme="majorBidi" w:cstheme="majorBidi"/>
               </w:rPr>
-              <w:t>{{ item.</w:t>
-            </w:r>
+              <w:t xml:space="preserve">{{ </w:t>
+            </w:r>
+            <w:proofErr w:type="spellStart"/>
             <w:r>
               <w:rPr>
                 <w:rFonts w:asciiTheme="majorBidi" w:hAnsiTheme="majorBidi" w:cstheme="majorBidi"/>
               </w:rPr>
+              <w:t>item.</w:t>
+            </w:r>
+            <w:r>
+              <w:rPr>
+                <w:rFonts w:asciiTheme="majorBidi" w:hAnsiTheme="majorBidi" w:cstheme="majorBidi"/>
+              </w:rPr>
               <w:t>deadline</w:t>
             </w:r>
+            <w:proofErr w:type="spellEnd"/>
             <w:r>
               <w:rPr>
                 <w:rFonts w:asciiTheme="majorBidi" w:hAnsiTheme="majorBidi" w:cstheme="majorBidi"/>
@@ -1197,12 +1219,6 @@
         </w:tc>
       </w:tr>
       <w:tr>
-        <w:tblPrEx>
-          <w:tblCellMar>
-            <w:top w:w="0" w:type="dxa"/>
-            <w:bottom w:w="0" w:type="dxa"/>
-          </w:tblCellMar>
-        </w:tblPrEx>
         <w:tc>
           <w:tcPr>
             <w:tcW w:w="4680" w:type="dxa"/>
@@ -1226,7 +1242,21 @@
               <w:rPr>
                 <w:rFonts w:asciiTheme="majorBidi" w:hAnsiTheme="majorBidi" w:cstheme="majorBidi"/>
               </w:rPr>
-              <w:t>{%tr endfor %}</w:t>
+              <w:t xml:space="preserve">{%tr </w:t>
+            </w:r>
+            <w:proofErr w:type="spellStart"/>
+            <w:r>
+              <w:rPr>
+                <w:rFonts w:asciiTheme="majorBidi" w:hAnsiTheme="majorBidi" w:cstheme="majorBidi"/>
+              </w:rPr>
+              <w:t>endfor</w:t>
+            </w:r>
+            <w:proofErr w:type="spellEnd"/>
+            <w:r>
+              <w:rPr>
+                <w:rFonts w:asciiTheme="majorBidi" w:hAnsiTheme="majorBidi" w:cstheme="majorBidi"/>
+              </w:rPr>
+              <w:t xml:space="preserve"> %}</w:t>
             </w:r>
           </w:p>
         </w:tc>

</xml_diff>